<commit_message>
Ajout du réseau PERT, des matrices RACI et parties prenantes, et de l'auto-évaluation
</commit_message>
<xml_diff>
--- a/01-techniques-de-gestion-de-projets/rendu-de-sousa-nunes-alessandro/projet-1-charte-decoupage/charte-de-projet.docx
+++ b/01-techniques-de-gestion-de-projets/rendu-de-sousa-nunes-alessandro/projet-1-charte-decoupage/charte-de-projet.docx
@@ -2396,6 +2396,212 @@
     </w:tbl>
     <w:p>
       <w:pPr>
+        <w:pStyle w:val="NormalWeb"/>
+        <w:rPr>
+          <w:rFonts w:ascii="Calibri" w:hAnsi="Calibri" w:cs="Calibri"/>
+          <w:sz w:val="22"/>
+          <w:szCs w:val="22"/>
+        </w:rPr>
+      </w:pPr>
+      <w:r>
+        <w:rPr>
+          <w:rFonts w:ascii="Calibri" w:hAnsi="Calibri" w:cs="Calibri"/>
+          <w:b/>
+          <w:bCs/>
+          <w:sz w:val="22"/>
+          <w:szCs w:val="22"/>
+        </w:rPr>
+        <w:t>Matrice pouvoir / intérêt.</w:t>
+      </w:r>
+      <w:r>
+        <w:rPr>
+          <w:rFonts w:ascii="Calibri" w:hAnsi="Calibri" w:cs="Calibri"/>
+          <w:sz w:val="22"/>
+          <w:szCs w:val="22"/>
+        </w:rPr>
+        <w:t xml:space="preserve"> Pour savoir comment communiquer avec chacun, j'ai placé les parties prenantes sur une matrice pouvoir / intérêt (fichier </w:t>
+      </w:r>
+      <w:r>
+        <w:rPr>
+          <w:rFonts w:ascii="Calibri" w:hAnsi="Calibri" w:cs="Calibri"/>
+          <w:i/>
+          <w:iCs/>
+          <w:sz w:val="22"/>
+          <w:szCs w:val="22"/>
+        </w:rPr>
+        <w:t>parties-prenantes-et-raci.xlsx</w:t>
+      </w:r>
+      <w:r>
+        <w:rPr>
+          <w:rFonts w:ascii="Calibri" w:hAnsi="Calibri" w:cs="Calibri"/>
+          <w:sz w:val="22"/>
+          <w:szCs w:val="22"/>
+        </w:rPr>
+        <w:t>, la stratégie est calculée par formule). J'y ai ajouté la gérance de l'immeuble et le traiteur : ils s'intéressent peu au projet, mais ils peuvent le bloquer (accès, parking, repas). Il faut donc les garder satisfaits dès le début.</w:t>
+      </w:r>
+    </w:p>
+    <w:p>
+      <w:pPr>
+        <w:pStyle w:val="NormalWeb"/>
+        <w:rPr>
+          <w:rFonts w:ascii="Calibri" w:hAnsi="Calibri" w:cs="Calibri"/>
+          <w:sz w:val="22"/>
+          <w:szCs w:val="22"/>
+        </w:rPr>
+      </w:pPr>
+      <w:r>
+        <w:rPr>
+          <w:rFonts w:ascii="Calibri" w:hAnsi="Calibri" w:cs="Calibri"/>
+          <w:noProof/>
+          <w:sz w:val="22"/>
+          <w:szCs w:val="22"/>
+        </w:rPr>
+        <w:drawing>
+          <wp:inline distT="0" distB="0" distL="0" distR="0" wp14:anchorId="573606F8" wp14:editId="6E69CF59">
+            <wp:extent cx="4953000" cy="5346975"/>
+            <wp:effectExtent l="0" t="0" r="0" b="6350"/>
+            <wp:docPr id="1" name="Image 1"/>
+            <wp:cNvGraphicFramePr>
+              <a:graphicFrameLocks xmlns:a="http://schemas.openxmlformats.org/drawingml/2006/main" noChangeAspect="1"/>
+            </wp:cNvGraphicFramePr>
+            <a:graphic xmlns:a="http://schemas.openxmlformats.org/drawingml/2006/main">
+              <a:graphicData uri="http://schemas.openxmlformats.org/drawingml/2006/picture">
+                <pic:pic xmlns:pic="http://schemas.openxmlformats.org/drawingml/2006/picture">
+                  <pic:nvPicPr>
+                    <pic:cNvPr id="0" name="Picture 1"/>
+                    <pic:cNvPicPr>
+                      <a:picLocks noChangeAspect="1" noChangeArrowheads="1"/>
+                    </pic:cNvPicPr>
+                  </pic:nvPicPr>
+                  <pic:blipFill>
+                    <a:blip r:embed="rId5">
+                      <a:extLst>
+                        <a:ext uri="{28A0092B-C50C-407E-A947-70E740481C1C}">
+                          <a14:useLocalDpi xmlns:a14="http://schemas.microsoft.com/office/drawing/2010/main" val="0"/>
+                        </a:ext>
+                      </a:extLst>
+                    </a:blip>
+                    <a:srcRect/>
+                    <a:stretch>
+                      <a:fillRect/>
+                    </a:stretch>
+                  </pic:blipFill>
+                  <pic:spPr bwMode="auto">
+                    <a:xfrm>
+                      <a:off x="0" y="0"/>
+                      <a:ext cx="4953000" cy="5346975"/>
+                    </a:xfrm>
+                    <a:prstGeom prst="rect">
+                      <a:avLst/>
+                    </a:prstGeom>
+                    <a:noFill/>
+                    <a:ln>
+                      <a:noFill/>
+                    </a:ln>
+                  </pic:spPr>
+                </pic:pic>
+              </a:graphicData>
+            </a:graphic>
+          </wp:inline>
+        </w:drawing>
+      </w:r>
+    </w:p>
+    <w:p>
+      <w:pPr>
+        <w:pStyle w:val="NormalWeb"/>
+        <w:rPr>
+          <w:rFonts w:ascii="Calibri" w:hAnsi="Calibri" w:cs="Calibri"/>
+          <w:sz w:val="22"/>
+          <w:szCs w:val="22"/>
+        </w:rPr>
+      </w:pPr>
+      <w:r>
+        <w:rPr>
+          <w:rFonts w:ascii="Calibri" w:hAnsi="Calibri" w:cs="Calibri"/>
+          <w:b/>
+          <w:bCs/>
+          <w:sz w:val="22"/>
+          <w:szCs w:val="22"/>
+        </w:rPr>
+        <w:t>Rôles et responsabilités (RACI).</w:t>
+      </w:r>
+      <w:r>
+        <w:rPr>
+          <w:rFonts w:ascii="Calibri" w:hAnsi="Calibri" w:cs="Calibri"/>
+          <w:sz w:val="22"/>
+          <w:szCs w:val="22"/>
+        </w:rPr>
+        <w:t xml:space="preserve"> Pour chaque grande activité, la matrice indique qui réalise (R), qui approuve (A, une seule personne), qui est consulté (C) et qui est informé (I). Une formule vérifie qu'il y a bien un seul A par ligne.</w:t>
+      </w:r>
+    </w:p>
+    <w:p>
+      <w:pPr>
+        <w:pStyle w:val="NormalWeb"/>
+        <w:rPr>
+          <w:rFonts w:ascii="Calibri" w:hAnsi="Calibri" w:cs="Calibri"/>
+          <w:sz w:val="22"/>
+          <w:szCs w:val="22"/>
+        </w:rPr>
+      </w:pPr>
+      <w:r>
+        <w:rPr>
+          <w:rFonts w:ascii="Calibri" w:hAnsi="Calibri" w:cs="Calibri"/>
+          <w:noProof/>
+          <w:sz w:val="22"/>
+          <w:szCs w:val="22"/>
+        </w:rPr>
+        <w:drawing>
+          <wp:inline distT="0" distB="0" distL="0" distR="0" wp14:anchorId="42AB8133" wp14:editId="2798FC5D">
+            <wp:extent cx="6096000" cy="2959252"/>
+            <wp:effectExtent l="0" t="0" r="0" b="0"/>
+            <wp:docPr id="2" name="Image 2"/>
+            <wp:cNvGraphicFramePr>
+              <a:graphicFrameLocks xmlns:a="http://schemas.openxmlformats.org/drawingml/2006/main" noChangeAspect="1"/>
+            </wp:cNvGraphicFramePr>
+            <a:graphic xmlns:a="http://schemas.openxmlformats.org/drawingml/2006/main">
+              <a:graphicData uri="http://schemas.openxmlformats.org/drawingml/2006/picture">
+                <pic:pic xmlns:pic="http://schemas.openxmlformats.org/drawingml/2006/picture">
+                  <pic:nvPicPr>
+                    <pic:cNvPr id="0" name="Picture 2"/>
+                    <pic:cNvPicPr>
+                      <a:picLocks noChangeAspect="1" noChangeArrowheads="1"/>
+                    </pic:cNvPicPr>
+                  </pic:nvPicPr>
+                  <pic:blipFill>
+                    <a:blip r:embed="rId6">
+                      <a:extLst>
+                        <a:ext uri="{28A0092B-C50C-407E-A947-70E740481C1C}">
+                          <a14:useLocalDpi xmlns:a14="http://schemas.microsoft.com/office/drawing/2010/main" val="0"/>
+                        </a:ext>
+                      </a:extLst>
+                    </a:blip>
+                    <a:srcRect/>
+                    <a:stretch>
+                      <a:fillRect/>
+                    </a:stretch>
+                  </pic:blipFill>
+                  <pic:spPr bwMode="auto">
+                    <a:xfrm>
+                      <a:off x="0" y="0"/>
+                      <a:ext cx="6096000" cy="2959252"/>
+                    </a:xfrm>
+                    <a:prstGeom prst="rect">
+                      <a:avLst/>
+                    </a:prstGeom>
+                    <a:noFill/>
+                    <a:ln>
+                      <a:noFill/>
+                    </a:ln>
+                  </pic:spPr>
+                </pic:pic>
+              </a:graphicData>
+            </a:graphic>
+          </wp:inline>
+        </w:drawing>
+      </w:r>
+    </w:p>
+    <w:p>
+      <w:pPr>
         <w:pStyle w:val="Titre2"/>
         <w:rPr>
           <w:rFonts w:ascii="Calibri" w:eastAsia="Times New Roman" w:hAnsi="Calibri" w:cs="Calibri"/>
@@ -2533,15 +2739,7 @@
           <w:sz w:val="22"/>
           <w:szCs w:val="22"/>
         </w:rPr>
-        <w:t xml:space="preserve"> </w:t>
-      </w:r>
-      <w:r>
-        <w:rPr>
-          <w:rFonts w:ascii="Calibri" w:eastAsia="Times New Roman" w:hAnsi="Calibri" w:cs="Calibri"/>
-          <w:sz w:val="22"/>
-          <w:szCs w:val="22"/>
-        </w:rPr>
-        <w:t>trop peu d'inscrits, traiteur indisponible, collaborateurs absents le jour J, panne du matériel de démonstration. Mesures prévues : relance des invités au jalon J5, devis demandés à deux traiteurs, planning de présence validé tôt, matériel testé lors de la répétition générale.</w:t>
+        <w:t xml:space="preserve"> trop peu d'inscrits, traiteur indisponible, collaborateurs absents le jour J, panne du matériel de démonstration. Mesures prévues : relance des invités au jalon J5, devis demandés à deux traiteurs, planning de présence validé tôt, matériel testé lors de la répétition générale.</w:t>
       </w:r>
     </w:p>
     <w:p>
@@ -3647,10 +3845,10 @@
           <w:szCs w:val="22"/>
         </w:rPr>
         <w:drawing>
-          <wp:inline distT="0" distB="0" distL="0" distR="0" wp14:anchorId="7EEFF14F" wp14:editId="401E017F">
+          <wp:inline distT="0" distB="0" distL="0" distR="0" wp14:anchorId="2F7415DC" wp14:editId="1D9F3583">
             <wp:extent cx="6096000" cy="9703299"/>
             <wp:effectExtent l="0" t="0" r="0" b="0"/>
-            <wp:docPr id="1" name="Image 1"/>
+            <wp:docPr id="3" name="Image 3"/>
             <wp:cNvGraphicFramePr>
               <a:graphicFrameLocks xmlns:a="http://schemas.openxmlformats.org/drawingml/2006/main" noChangeAspect="1"/>
             </wp:cNvGraphicFramePr>
@@ -3658,13 +3856,13 @@
               <a:graphicData uri="http://schemas.openxmlformats.org/drawingml/2006/picture">
                 <pic:pic xmlns:pic="http://schemas.openxmlformats.org/drawingml/2006/picture">
                   <pic:nvPicPr>
-                    <pic:cNvPr id="0" name="Picture 1"/>
+                    <pic:cNvPr id="0" name="Picture 3"/>
                     <pic:cNvPicPr>
                       <a:picLocks noChangeAspect="1" noChangeArrowheads="1"/>
                     </pic:cNvPicPr>
                   </pic:nvPicPr>
                   <pic:blipFill>
-                    <a:blip r:embed="rId5">
+                    <a:blip r:embed="rId7">
                       <a:extLst>
                         <a:ext uri="{28A0092B-C50C-407E-A947-70E740481C1C}">
                           <a14:useLocalDpi xmlns:a14="http://schemas.microsoft.com/office/drawing/2010/main" val="0"/>
@@ -3713,10 +3911,10 @@
           <w:szCs w:val="22"/>
         </w:rPr>
         <w:drawing>
-          <wp:inline distT="0" distB="0" distL="0" distR="0" wp14:anchorId="3DFD4CB0" wp14:editId="652CAD27">
+          <wp:inline distT="0" distB="0" distL="0" distR="0" wp14:anchorId="672743C5" wp14:editId="7E1DBA2E">
             <wp:extent cx="6096000" cy="9703299"/>
             <wp:effectExtent l="0" t="0" r="0" b="0"/>
-            <wp:docPr id="2" name="Image 2"/>
+            <wp:docPr id="4" name="Image 4"/>
             <wp:cNvGraphicFramePr>
               <a:graphicFrameLocks xmlns:a="http://schemas.openxmlformats.org/drawingml/2006/main" noChangeAspect="1"/>
             </wp:cNvGraphicFramePr>
@@ -3724,13 +3922,13 @@
               <a:graphicData uri="http://schemas.openxmlformats.org/drawingml/2006/picture">
                 <pic:pic xmlns:pic="http://schemas.openxmlformats.org/drawingml/2006/picture">
                   <pic:nvPicPr>
-                    <pic:cNvPr id="0" name="Picture 2"/>
+                    <pic:cNvPr id="0" name="Picture 4"/>
                     <pic:cNvPicPr>
                       <a:picLocks noChangeAspect="1" noChangeArrowheads="1"/>
                     </pic:cNvPicPr>
                   </pic:nvPicPr>
                   <pic:blipFill>
-                    <a:blip r:embed="rId6">
+                    <a:blip r:embed="rId8">
                       <a:extLst>
                         <a:ext uri="{28A0092B-C50C-407E-A947-70E740481C1C}">
                           <a14:useLocalDpi xmlns:a14="http://schemas.microsoft.com/office/drawing/2010/main" val="0"/>
@@ -5117,10 +5315,10 @@
           <w:szCs w:val="22"/>
         </w:rPr>
         <w:drawing>
-          <wp:inline distT="0" distB="0" distL="0" distR="0" wp14:anchorId="2A6FF564" wp14:editId="26815C4B">
+          <wp:inline distT="0" distB="0" distL="0" distR="0" wp14:anchorId="3EB6D97C" wp14:editId="38F83F02">
             <wp:extent cx="6102350" cy="4203916"/>
             <wp:effectExtent l="0" t="0" r="0" b="6350"/>
-            <wp:docPr id="3" name="Image 3"/>
+            <wp:docPr id="5" name="Image 5"/>
             <wp:cNvGraphicFramePr>
               <a:graphicFrameLocks xmlns:a="http://schemas.openxmlformats.org/drawingml/2006/main" noChangeAspect="1"/>
             </wp:cNvGraphicFramePr>
@@ -5128,13 +5326,13 @@
               <a:graphicData uri="http://schemas.openxmlformats.org/drawingml/2006/picture">
                 <pic:pic xmlns:pic="http://schemas.openxmlformats.org/drawingml/2006/picture">
                   <pic:nvPicPr>
-                    <pic:cNvPr id="0" name="Picture 3"/>
+                    <pic:cNvPr id="0" name="Picture 5"/>
                     <pic:cNvPicPr>
                       <a:picLocks noChangeAspect="1" noChangeArrowheads="1"/>
                     </pic:cNvPicPr>
                   </pic:nvPicPr>
                   <pic:blipFill>
-                    <a:blip r:embed="rId7">
+                    <a:blip r:embed="rId9">
                       <a:extLst>
                         <a:ext uri="{28A0092B-C50C-407E-A947-70E740481C1C}">
                           <a14:useLocalDpi xmlns:a14="http://schemas.microsoft.com/office/drawing/2010/main" val="0"/>
@@ -6233,9 +6431,9 @@
 <file path=word/numbering.xml><?xml version="1.0" encoding="utf-8"?>
 <w:numbering xmlns:wpc="http://schemas.microsoft.com/office/word/2010/wordprocessingCanvas" xmlns:cx="http://schemas.microsoft.com/office/drawing/2014/chartex" xmlns:cx1="http://schemas.microsoft.com/office/drawing/2015/9/8/chartex" xmlns:cx2="http://schemas.microsoft.com/office/drawing/2015/10/21/chartex" xmlns:cx3="http://schemas.microsoft.com/office/drawing/2016/5/9/chartex" xmlns:cx4="http://schemas.microsoft.com/office/drawing/2016/5/10/chartex" xmlns:cx5="http://schemas.microsoft.com/office/drawing/2016/5/11/chartex" xmlns:cx6="http://schemas.microsoft.com/office/drawing/2016/5/12/chartex" xmlns:cx7="http://schemas.microsoft.com/office/drawing/2016/5/13/chartex" xmlns:cx8="http://schemas.microsoft.com/office/drawing/2016/5/14/chartex" xmlns:mc="http://schemas.openxmlformats.org/markup-compatibility/2006" xmlns:aink="http://schemas.microsoft.com/office/drawing/2016/ink" xmlns:am3d="http://schemas.microsoft.com/office/drawing/2017/model3d" xmlns:o="urn:schemas-microsoft-com:office:office" xmlns:oel="http://schemas.microsoft.com/office/2019/extlst" xmlns:r="http://schemas.openxmlformats.org/officeDocument/2006/relationships" xmlns:m="http://schemas.openxmlformats.org/officeDocument/2006/math" xmlns:v="urn:schemas-microsoft-com:vml" xmlns:wp14="http://schemas.microsoft.com/office/word/2010/wordprocessingDrawing" xmlns:wp="http://schemas.openxmlformats.org/drawingml/2006/wordprocessingDrawing" xmlns:w10="urn:schemas-microsoft-com:office:word" xmlns:w="http://schemas.openxmlformats.org/wordprocessingml/2006/main" xmlns:w14="http://schemas.microsoft.com/office/word/2010/wordml" xmlns:w15="http://schemas.microsoft.com/office/word/2012/wordml" xmlns:w16cex="http://schemas.microsoft.com/office/word/2018/wordml/cex" xmlns:w16cid="http://schemas.microsoft.com/office/word/2016/wordml/cid" xmlns:w16="http://schemas.microsoft.com/office/word/2018/wordml" xmlns:w16du="http://schemas.microsoft.com/office/word/2023/wordml/word16du" xmlns:w16sdtdh="http://schemas.microsoft.com/office/word/2020/wordml/sdtdatahash" xmlns:w16sdtfl="http://schemas.microsoft.com/office/word/2024/wordml/sdtformatlock" xmlns:w16se="http://schemas.microsoft.com/office/word/2015/wordml/symex" xmlns:wpg="http://schemas.microsoft.com/office/word/2010/wordprocessingGroup" xmlns:wpi="http://schemas.microsoft.com/office/word/2010/wordprocessingInk" xmlns:wne="http://schemas.microsoft.com/office/word/2006/wordml" xmlns:wps="http://schemas.microsoft.com/office/word/2010/wordprocessingShape" mc:Ignorable="w14 w15 w16se w16cid w16 w16cex w16sdtdh w16sdtfl w16du wp14">
   <w:abstractNum w:abstractNumId="0" w15:restartNumberingAfterBreak="0">
-    <w:nsid w:val="02A51AA8"/>
+    <w:nsid w:val="174903EC"/>
     <w:multiLevelType w:val="multilevel"/>
-    <w:tmpl w:val="948AF9BC"/>
+    <w:tmpl w:val="58FAF6D2"/>
     <w:lvl w:ilvl="0">
       <w:start w:val="1"/>
       <w:numFmt w:val="bullet"/>
@@ -6382,9 +6580,9 @@
     </w:lvl>
   </w:abstractNum>
   <w:abstractNum w:abstractNumId="1" w15:restartNumberingAfterBreak="0">
-    <w:nsid w:val="040155EB"/>
+    <w:nsid w:val="1C650727"/>
     <w:multiLevelType w:val="multilevel"/>
-    <w:tmpl w:val="A5FC625A"/>
+    <w:tmpl w:val="17FA52B0"/>
     <w:lvl w:ilvl="0">
       <w:start w:val="1"/>
       <w:numFmt w:val="bullet"/>
@@ -6531,9 +6729,9 @@
     </w:lvl>
   </w:abstractNum>
   <w:abstractNum w:abstractNumId="2" w15:restartNumberingAfterBreak="0">
-    <w:nsid w:val="147A33CD"/>
+    <w:nsid w:val="1FBE0408"/>
     <w:multiLevelType w:val="multilevel"/>
-    <w:tmpl w:val="AB60F1F2"/>
+    <w:tmpl w:val="F0826412"/>
     <w:lvl w:ilvl="0">
       <w:start w:val="1"/>
       <w:numFmt w:val="bullet"/>
@@ -6680,9 +6878,9 @@
     </w:lvl>
   </w:abstractNum>
   <w:abstractNum w:abstractNumId="3" w15:restartNumberingAfterBreak="0">
-    <w:nsid w:val="49BF66E0"/>
+    <w:nsid w:val="5EDA2EDF"/>
     <w:multiLevelType w:val="multilevel"/>
-    <w:tmpl w:val="F3549966"/>
+    <w:tmpl w:val="C2EC75B6"/>
     <w:lvl w:ilvl="0">
       <w:start w:val="1"/>
       <w:numFmt w:val="bullet"/>
@@ -6829,9 +7027,9 @@
     </w:lvl>
   </w:abstractNum>
   <w:abstractNum w:abstractNumId="4" w15:restartNumberingAfterBreak="0">
-    <w:nsid w:val="4FAC510F"/>
+    <w:nsid w:val="7EAE1F81"/>
     <w:multiLevelType w:val="multilevel"/>
-    <w:tmpl w:val="EAC41BCC"/>
+    <w:tmpl w:val="8EB65934"/>
     <w:lvl w:ilvl="0">
       <w:start w:val="1"/>
       <w:numFmt w:val="bullet"/>
@@ -6977,20 +7175,20 @@
       </w:rPr>
     </w:lvl>
   </w:abstractNum>
-  <w:num w:numId="1" w16cid:durableId="1176529893">
+  <w:num w:numId="1" w16cid:durableId="1006133041">
     <w:abstractNumId w:val="2"/>
   </w:num>
-  <w:num w:numId="2" w16cid:durableId="926962655">
+  <w:num w:numId="2" w16cid:durableId="848445017">
     <w:abstractNumId w:val="0"/>
   </w:num>
-  <w:num w:numId="3" w16cid:durableId="1568567828">
-    <w:abstractNumId w:val="4"/>
-  </w:num>
-  <w:num w:numId="4" w16cid:durableId="1240023532">
+  <w:num w:numId="3" w16cid:durableId="1077479090">
     <w:abstractNumId w:val="1"/>
   </w:num>
-  <w:num w:numId="5" w16cid:durableId="951088975">
+  <w:num w:numId="4" w16cid:durableId="763065051">
     <w:abstractNumId w:val="3"/>
+  </w:num>
+  <w:num w:numId="5" w16cid:durableId="967510635">
+    <w:abstractNumId w:val="4"/>
   </w:num>
 </w:numbering>
 </file>

</xml_diff>